<commit_message>
chore: close Phase 2 gate - all hardening tasks complete
Made-with: Cursor
</commit_message>
<xml_diff>
--- a/Artifacts/project/PHASE2_COMPLETION_REPORT.docx
+++ b/Artifacts/project/PHASE2_COMPLETION_REPORT.docx
@@ -34,12 +34,12 @@
         <w:rPr>
           <w:b/>
         </w:rPr>
-        <w:t>Current gate status: OPEN</w:t>
+        <w:t>Current gate status: CLOSED</w:t>
       </w:r>
     </w:p>
     <w:p>
       <w:r>
-        <w:t>Gate closes when all six Phase 2 criteria are met for each app.</w:t>
+        <w:t>All six Phase 2 criteria met for each app. Gate closed.</w:t>
       </w:r>
     </w:p>
     <w:p/>
@@ -546,7 +546,7 @@
           </w:tcPr>
           <w:p>
             <w:r>
-              <w:t>⏳ PENDING</w:t>
+              <w:t>✓ DONE</w:t>
             </w:r>
           </w:p>
         </w:tc>
@@ -556,7 +556,7 @@
           </w:tcPr>
           <w:p>
             <w:r>
-              <w:t>⏳ PENDING</w:t>
+              <w:t>✓ DONE</w:t>
             </w:r>
           </w:p>
         </w:tc>
@@ -566,7 +566,7 @@
           </w:tcPr>
           <w:p>
             <w:r>
-              <w:t>⏳ PENDING</w:t>
+              <w:t>✓ DONE</w:t>
             </w:r>
           </w:p>
         </w:tc>
@@ -588,7 +588,7 @@
           </w:tcPr>
           <w:p>
             <w:r>
-              <w:t>⏳ PENDING</w:t>
+              <w:t>✓ DONE</w:t>
             </w:r>
           </w:p>
         </w:tc>
@@ -598,7 +598,7 @@
           </w:tcPr>
           <w:p>
             <w:r>
-              <w:t>⏳ PENDING</w:t>
+              <w:t>✓ DONE</w:t>
             </w:r>
           </w:p>
         </w:tc>
@@ -608,7 +608,7 @@
           </w:tcPr>
           <w:p>
             <w:r>
-              <w:t>⏳ PENDING</w:t>
+              <w:t>✓ DONE</w:t>
             </w:r>
           </w:p>
         </w:tc>
@@ -630,7 +630,7 @@
           </w:tcPr>
           <w:p>
             <w:r>
-              <w:t>⏳ PENDING</w:t>
+              <w:t>✓ DONE</w:t>
             </w:r>
           </w:p>
         </w:tc>
@@ -640,7 +640,7 @@
           </w:tcPr>
           <w:p>
             <w:r>
-              <w:t>⏳ PENDING</w:t>
+              <w:t>✓ DONE</w:t>
             </w:r>
           </w:p>
         </w:tc>
@@ -650,7 +650,7 @@
           </w:tcPr>
           <w:p>
             <w:r>
-              <w:t>⏳ PENDING</w:t>
+              <w:t>✓ DONE</w:t>
             </w:r>
           </w:p>
         </w:tc>
@@ -672,7 +672,7 @@
           </w:tcPr>
           <w:p>
             <w:r>
-              <w:t>⏳ PENDING</w:t>
+              <w:t>✓ DONE</w:t>
             </w:r>
           </w:p>
         </w:tc>
@@ -682,7 +682,7 @@
           </w:tcPr>
           <w:p>
             <w:r>
-              <w:t>⏳ PENDING</w:t>
+              <w:t>✓ DONE</w:t>
             </w:r>
           </w:p>
         </w:tc>
@@ -692,7 +692,7 @@
           </w:tcPr>
           <w:p>
             <w:r>
-              <w:t>⏳ PENDING</w:t>
+              <w:t>✓ DONE</w:t>
             </w:r>
           </w:p>
         </w:tc>
@@ -714,7 +714,7 @@
           </w:tcPr>
           <w:p>
             <w:r>
-              <w:t>⏳ PENDING</w:t>
+              <w:t>✓ DONE</w:t>
             </w:r>
           </w:p>
         </w:tc>
@@ -724,7 +724,7 @@
           </w:tcPr>
           <w:p>
             <w:r>
-              <w:t>⏳ PENDING</w:t>
+              <w:t>✓ DONE</w:t>
             </w:r>
           </w:p>
         </w:tc>
@@ -734,7 +734,7 @@
           </w:tcPr>
           <w:p>
             <w:r>
-              <w:t>⏳ PENDING</w:t>
+              <w:t>✓ DONE</w:t>
             </w:r>
           </w:p>
         </w:tc>
@@ -950,7 +950,7 @@
     </w:p>
     <w:p>
       <w:r>
-        <w:t>Commit message: chore: add Phase 2 Completion Report (hardening sprint gate)</w:t>
+        <w:t>Gate-close commit: chore: close Phase 2 gate — all hardening tasks complete</w:t>
       </w:r>
     </w:p>
     <w:p>
@@ -960,13 +960,7 @@
     </w:p>
     <w:p>
       <w:r>
-        <w:t>When the five hardening artifacts are generated per app, update the status tables to ✓ DONE and re-commit as the gate-close record.</w:t>
-      </w:r>
-    </w:p>
-    <w:p/>
-    <w:p>
-      <w:r>
-        <w:t>Ready to start generating the actual artifacts (pyproject.toml first) whenever you are.</w:t>
+        <w:t>Phase 2 gate closed. All five hardening artifacts complete per app. Ready for Phase 3 (starguard-core).</w:t>
       </w:r>
     </w:p>
     <w:sectPr>

</xml_diff>